<commit_message>
docs(report): merge GenAI appendix into main PDF (4 sections + 12 screenshots)
Per coursework spec the GenAI disclosure is an appendix to the main
report, not a separate document. Merged into report.tex so a single
QMplus upload carries everything:

  pp. 1-7   Main report (within 10-page limit)
  pp. 8-20  Appendix: GenAI Usage Disclosure
    A. Scope and philosophy of AI use
    B. Tools used (Claude Opus 4.7, Codex CLI 0.128.0)
    C. Concrete tasks delegated (boilerplate + translation only)
    D. Verification and final authorship
    E. Six prompt/output screenshot pairs covering every AI usage
       (CREATE TABLE, INSERT rows, translation, Codex review,
        violin-plot code, raincloud-plot code)

Appendix is explicitly out of scope of the 10-page limit by the
coursework specification.

Co-Authored-By: Claude Opus 4.7 (1M context) <noreply@anthropic.com>
</commit_message>
<xml_diff>
--- a/docs/report/EBU5503_Hotel_DB_Report.docx
+++ b/docs/report/EBU5503_Hotel_DB_Report.docx
@@ -4423,7 +4423,1818 @@
         <w:t xml:space="preserve">decision-making, not merely passive storage.</w:t>
       </w:r>
     </w:p>
+    <w:p>
+      <w:pPr>
+        <w:pStyle w:val="BodyText"/>
+      </w:pPr>
+      <w:r>
+        <w:rPr>
+          <w:b/>
+          <w:bCs/>
+        </w:rPr>
+        <w:t xml:space="preserve">Appendix: GenAI Usage Disclosure</w:t>
+      </w:r>
+    </w:p>
+    <w:p>
+      <w:pPr>
+        <w:pStyle w:val="BodyText"/>
+      </w:pPr>
+      <w:r>
+        <w:rPr>
+          <w:i/>
+          <w:iCs/>
+        </w:rPr>
+        <w:t xml:space="preserve">Mandatory disclosure per EBU5503 coursework specification.</w:t>
+      </w:r>
+      <w:r>
+        <w:rPr>
+          <w:i/>
+          <w:iCs/>
+        </w:rPr>
+        <w:t xml:space="preserve"> </w:t>
+      </w:r>
+      <w:r>
+        <w:rPr>
+          <w:i/>
+          <w:iCs/>
+        </w:rPr>
+        <w:t xml:space="preserve">This appendix is not counted toward the 10-page report limit.</w:t>
+      </w:r>
+    </w:p>
     <w:bookmarkEnd w:id="48"/>
+    <w:bookmarkStart w:id="49" w:name="scope-and-philosophy-of-ai-use"/>
+    <w:p>
+      <w:pPr>
+        <w:pStyle w:val="Heading1"/>
+      </w:pPr>
+      <w:r>
+        <w:t xml:space="preserve">Scope and Philosophy of AI Use</w:t>
+      </w:r>
+    </w:p>
+    <w:p>
+      <w:pPr>
+        <w:pStyle w:val="FirstParagraph"/>
+      </w:pPr>
+      <w:r>
+        <w:t xml:space="preserve">All conceptual decisions – the choice of Scenario 2, the eleven-entity</w:t>
+      </w:r>
+      <w:r>
+        <w:t xml:space="preserve"> </w:t>
+      </w:r>
+      <w:r>
+        <w:t xml:space="preserve">schema, the normalisation reasoning, the dynamic-pricing innovation, the</w:t>
+      </w:r>
+      <w:r>
+        <w:t xml:space="preserve"> </w:t>
+      </w:r>
+      <w:r>
+        <w:t xml:space="preserve">12-query strategy, and the report’s narrative – were authored by the seven</w:t>
+      </w:r>
+      <w:r>
+        <w:t xml:space="preserve"> </w:t>
+      </w:r>
+      <w:r>
+        <w:t xml:space="preserve">group members. We restricted GenAI to two narrow categories:</w:t>
+      </w:r>
+    </w:p>
+    <w:p>
+      <w:pPr>
+        <w:numPr>
+          <w:ilvl w:val="0"/>
+          <w:numId w:val="1002"/>
+        </w:numPr>
+      </w:pPr>
+      <w:r>
+        <w:rPr>
+          <w:b/>
+          <w:bCs/>
+        </w:rPr>
+        <w:t xml:space="preserve">Small, repetitive, mechanical coding</w:t>
+      </w:r>
+      <w:r>
+        <w:t xml:space="preserve"> </w:t>
+      </w:r>
+      <w:r>
+        <w:t xml:space="preserve">– the kind of</w:t>
+      </w:r>
+      <w:r>
+        <w:t xml:space="preserve"> </w:t>
+      </w:r>
+      <w:r>
+        <w:t xml:space="preserve">boilerplate that would otherwise be copy-paste-and-modify drudgery</w:t>
+      </w:r>
+      <w:r>
+        <w:t xml:space="preserve"> </w:t>
+      </w:r>
+      <w:r>
+        <w:t xml:space="preserve">(</w:t>
+      </w:r>
+      <w:r>
+        <w:rPr>
+          <w:rStyle w:val="VerbatimChar"/>
+        </w:rPr>
+        <w:t xml:space="preserve">CREATE TABLE</w:t>
+      </w:r>
+      <w:r>
+        <w:t xml:space="preserve"> </w:t>
+      </w:r>
+      <w:r>
+        <w:t xml:space="preserve">statements,</w:t>
+      </w:r>
+      <w:r>
+        <w:t xml:space="preserve"> </w:t>
+      </w:r>
+      <w:r>
+        <w:rPr>
+          <w:rStyle w:val="VerbatimChar"/>
+        </w:rPr>
+        <w:t xml:space="preserve">INSERT</w:t>
+      </w:r>
+      <w:r>
+        <w:t xml:space="preserve"> </w:t>
+      </w:r>
+      <w:r>
+        <w:t xml:space="preserve">rows,</w:t>
+      </w:r>
+      <w:r>
+        <w:t xml:space="preserve"> </w:t>
+      </w:r>
+      <w:r>
+        <w:t xml:space="preserve">fence-post date formatting,</w:t>
+      </w:r>
+      <w:r>
+        <w:t xml:space="preserve"> </w:t>
+      </w:r>
+      <w:r>
+        <w:rPr>
+          <w:rStyle w:val="VerbatimChar"/>
+        </w:rPr>
+        <w:t xml:space="preserve">matplotlib</w:t>
+      </w:r>
+      <w:r>
+        <w:t xml:space="preserve"> </w:t>
+      </w:r>
+      <w:r>
+        <w:t xml:space="preserve">plotting</w:t>
+      </w:r>
+      <w:r>
+        <w:t xml:space="preserve"> </w:t>
+      </w:r>
+      <w:r>
+        <w:t xml:space="preserve">boilerplate). The intellectual content came from the human design;</w:t>
+      </w:r>
+      <w:r>
+        <w:t xml:space="preserve"> </w:t>
+      </w:r>
+      <w:r>
+        <w:t xml:space="preserve">the AI saved typing time only.</w:t>
+      </w:r>
+    </w:p>
+    <w:p>
+      <w:pPr>
+        <w:numPr>
+          <w:ilvl w:val="0"/>
+          <w:numId w:val="1002"/>
+        </w:numPr>
+      </w:pPr>
+      <w:r>
+        <w:rPr>
+          <w:b/>
+          <w:bCs/>
+        </w:rPr>
+        <w:t xml:space="preserve">Language polishing and Chinese </w:t>
+      </w:r>
+      <m:oMath>
+        <m:r>
+          <m:rPr>
+            <m:sty m:val="p"/>
+          </m:rPr>
+          <m:t>→</m:t>
+        </m:r>
+      </m:oMath>
+      <w:r>
+        <w:rPr>
+          <w:b/>
+          <w:bCs/>
+        </w:rPr>
+        <w:t xml:space="preserve"> English</w:t>
+      </w:r>
+      <w:r>
+        <w:rPr>
+          <w:b/>
+          <w:bCs/>
+        </w:rPr>
+        <w:t xml:space="preserve"> </w:t>
+      </w:r>
+      <w:r>
+        <w:rPr>
+          <w:b/>
+          <w:bCs/>
+        </w:rPr>
+        <w:t xml:space="preserve">translation</w:t>
+      </w:r>
+      <w:r>
+        <w:t xml:space="preserve"> </w:t>
+      </w:r>
+      <w:r>
+        <w:t xml:space="preserve">– converting the group’s Chinese-language design</w:t>
+      </w:r>
+      <w:r>
+        <w:t xml:space="preserve"> </w:t>
+      </w:r>
+      <w:r>
+        <w:t xml:space="preserve">notes and brainstorm bullets into academic English for the final</w:t>
+      </w:r>
+      <w:r>
+        <w:t xml:space="preserve"> </w:t>
+      </w:r>
+      <w:r>
+        <w:t xml:space="preserve">report.</w:t>
+      </w:r>
+    </w:p>
+    <w:p>
+      <w:pPr>
+        <w:pStyle w:val="FirstParagraph"/>
+      </w:pPr>
+      <w:r>
+        <w:t xml:space="preserve">We did</w:t>
+      </w:r>
+      <w:r>
+        <w:t xml:space="preserve"> </w:t>
+      </w:r>
+      <w:r>
+        <w:rPr>
+          <w:i/>
+          <w:iCs/>
+        </w:rPr>
+        <w:t xml:space="preserve">not</w:t>
+      </w:r>
+      <w:r>
+        <w:t xml:space="preserve"> </w:t>
+      </w:r>
+      <w:r>
+        <w:t xml:space="preserve">use AI to invent the design, write analytical</w:t>
+      </w:r>
+      <w:r>
+        <w:t xml:space="preserve"> </w:t>
+      </w:r>
+      <w:r>
+        <w:t xml:space="preserve">reasoning, generate the EER diagram, or draft answers we will give at the</w:t>
+      </w:r>
+      <w:r>
+        <w:t xml:space="preserve"> </w:t>
+      </w:r>
+      <w:r>
+        <w:t xml:space="preserve">defence – those are human authorship.</w:t>
+      </w:r>
+    </w:p>
+    <w:bookmarkEnd w:id="49"/>
+    <w:bookmarkStart w:id="50" w:name="tools-used"/>
+    <w:p>
+      <w:pPr>
+        <w:pStyle w:val="Heading1"/>
+      </w:pPr>
+      <w:r>
+        <w:t xml:space="preserve">Tools Used</w:t>
+      </w:r>
+    </w:p>
+    <w:tbl>
+      <w:tblPr>
+        <w:tblStyle w:val="Table"/>
+        <w:tblW w:type="auto" w:w="0"/>
+        <w:tblLook w:firstRow="1" w:lastRow="0" w:firstColumn="0" w:lastColumn="0" w:noHBand="0" w:noVBand="0" w:val="0020"/>
+      </w:tblPr>
+      <w:tblGrid>
+        <w:gridCol w:w="2640"/>
+        <w:gridCol w:w="2640"/>
+        <w:gridCol w:w="2640"/>
+      </w:tblGrid>
+      <w:tr>
+        <w:trPr>
+          <w:tblHeader w:val="on"/>
+        </w:trPr>
+        <w:tc>
+          <w:tcPr/>
+          <w:p>
+            <w:pPr>
+              <w:pStyle w:val="Compact"/>
+              <w:jc w:val="left"/>
+            </w:pPr>
+            <w:r>
+              <w:rPr>
+                <w:b/>
+                <w:bCs/>
+              </w:rPr>
+              <w:t xml:space="preserve">Tool</w:t>
+            </w:r>
+          </w:p>
+        </w:tc>
+        <w:tc>
+          <w:tcPr/>
+          <w:p>
+            <w:pPr>
+              <w:pStyle w:val="Compact"/>
+              <w:jc w:val="left"/>
+            </w:pPr>
+            <w:r>
+              <w:rPr>
+                <w:b/>
+                <w:bCs/>
+              </w:rPr>
+              <w:t xml:space="preserve">Vendor / Version</w:t>
+            </w:r>
+          </w:p>
+        </w:tc>
+        <w:tc>
+          <w:tcPr/>
+          <w:p>
+            <w:pPr>
+              <w:pStyle w:val="Compact"/>
+              <w:jc w:val="left"/>
+            </w:pPr>
+            <w:r>
+              <w:rPr>
+                <w:b/>
+                <w:bCs/>
+              </w:rPr>
+              <w:t xml:space="preserve">Where used</w:t>
+            </w:r>
+          </w:p>
+        </w:tc>
+      </w:tr>
+      <w:tr>
+        <w:tc>
+          <w:tcPr/>
+          <w:p>
+            <w:pPr>
+              <w:pStyle w:val="Compact"/>
+              <w:jc w:val="left"/>
+            </w:pPr>
+            <w:r>
+              <w:t xml:space="preserve">Claude Code (CLI)</w:t>
+            </w:r>
+          </w:p>
+        </w:tc>
+        <w:tc>
+          <w:tcPr/>
+          <w:p>
+            <w:pPr>
+              <w:pStyle w:val="Compact"/>
+              <w:jc w:val="left"/>
+            </w:pPr>
+            <w:r>
+              <w:t xml:space="preserve">Anthropic, Opus 4.7 (1M ctx)</w:t>
+            </w:r>
+          </w:p>
+        </w:tc>
+        <w:tc>
+          <w:tcPr/>
+          <w:p>
+            <w:pPr>
+              <w:pStyle w:val="Compact"/>
+              <w:jc w:val="left"/>
+            </w:pPr>
+            <w:r>
+              <w:t xml:space="preserve">Boilerplate generation, translation</w:t>
+            </w:r>
+          </w:p>
+        </w:tc>
+      </w:tr>
+      <w:tr>
+        <w:tc>
+          <w:tcPr/>
+          <w:p>
+            <w:pPr>
+              <w:pStyle w:val="Compact"/>
+              <w:jc w:val="left"/>
+            </w:pPr>
+            <w:r>
+              <w:t xml:space="preserve">Codex CLI (consult mode)</w:t>
+            </w:r>
+          </w:p>
+        </w:tc>
+        <w:tc>
+          <w:tcPr/>
+          <w:p>
+            <w:pPr>
+              <w:pStyle w:val="Compact"/>
+              <w:jc w:val="left"/>
+            </w:pPr>
+            <w:r>
+              <w:t xml:space="preserve">OpenAI, codex-cli 0.128.0</w:t>
+            </w:r>
+          </w:p>
+        </w:tc>
+        <w:tc>
+          <w:tcPr/>
+          <w:p>
+            <w:pPr>
+              <w:pStyle w:val="Compact"/>
+              <w:jc w:val="left"/>
+            </w:pPr>
+            <w:r>
+              <w:t xml:space="preserve">Independent SQL &amp; Python code review</w:t>
+            </w:r>
+          </w:p>
+        </w:tc>
+      </w:tr>
+    </w:tbl>
+    <w:p>
+      <w:pPr>
+        <w:pStyle w:val="BodyText"/>
+      </w:pPr>
+      <w:r>
+        <w:br/>
+      </w:r>
+      <w:r>
+        <w:t xml:space="preserve">No image-generation, voice, or web-search AI tools were used.</w:t>
+      </w:r>
+    </w:p>
+    <w:bookmarkEnd w:id="50"/>
+    <w:bookmarkStart w:id="51" w:name="concrete-tasks-delegated-to-ai"/>
+    <w:p>
+      <w:pPr>
+        <w:pStyle w:val="Heading1"/>
+      </w:pPr>
+      <w:r>
+        <w:t xml:space="preserve">Concrete Tasks Delegated to AI</w:t>
+      </w:r>
+    </w:p>
+    <w:tbl>
+      <w:tblPr>
+        <w:tblStyle w:val="Table"/>
+        <w:tblW w:type="auto" w:w="0"/>
+        <w:tblLook w:firstRow="1" w:lastRow="0" w:firstColumn="0" w:lastColumn="0" w:noHBand="0" w:noVBand="0" w:val="0020"/>
+      </w:tblPr>
+      <w:tblGrid>
+        <w:gridCol w:w="2640"/>
+        <w:gridCol w:w="2640"/>
+        <w:gridCol w:w="2640"/>
+      </w:tblGrid>
+      <w:tr>
+        <w:trPr>
+          <w:tblHeader w:val="on"/>
+        </w:trPr>
+        <w:tc>
+          <w:tcPr/>
+          <w:p>
+            <w:pPr>
+              <w:pStyle w:val="Compact"/>
+              <w:jc w:val="left"/>
+            </w:pPr>
+            <w:r>
+              <w:rPr>
+                <w:b/>
+                <w:bCs/>
+              </w:rPr>
+              <w:t xml:space="preserve">Artefact</w:t>
+            </w:r>
+          </w:p>
+        </w:tc>
+        <w:tc>
+          <w:tcPr/>
+          <w:p>
+            <w:pPr>
+              <w:pStyle w:val="Compact"/>
+              <w:jc w:val="left"/>
+            </w:pPr>
+            <w:r>
+              <w:rPr>
+                <w:b/>
+                <w:bCs/>
+              </w:rPr>
+              <w:t xml:space="preserve">AI contribution</w:t>
+            </w:r>
+          </w:p>
+        </w:tc>
+        <w:tc>
+          <w:tcPr/>
+          <w:p>
+            <w:pPr>
+              <w:pStyle w:val="Compact"/>
+              <w:jc w:val="left"/>
+            </w:pPr>
+            <w:r>
+              <w:rPr>
+                <w:b/>
+                <w:bCs/>
+              </w:rPr>
+              <w:t xml:space="preserve">Human input</w:t>
+            </w:r>
+          </w:p>
+        </w:tc>
+      </w:tr>
+      <w:tr>
+        <w:tc>
+          <w:tcPr/>
+          <w:p>
+            <w:pPr>
+              <w:pStyle w:val="Compact"/>
+              <w:jc w:val="left"/>
+            </w:pPr>
+            <w:r>
+              <w:rPr>
+                <w:rStyle w:val="VerbatimChar"/>
+              </w:rPr>
+              <w:t xml:space="preserve">init.sql</w:t>
+            </w:r>
+            <w:r>
+              <w:t xml:space="preserve"> </w:t>
+            </w:r>
+            <w:r>
+              <w:t xml:space="preserve">(11</w:t>
+            </w:r>
+            <w:r>
+              <w:t xml:space="preserve"> </w:t>
+            </w:r>
+            <w:r>
+              <w:rPr>
+                <w:rStyle w:val="VerbatimChar"/>
+              </w:rPr>
+              <w:t xml:space="preserve">CREATE TABLE</w:t>
+            </w:r>
+            <w:r>
+              <w:t xml:space="preserve">)</w:t>
+            </w:r>
+          </w:p>
+        </w:tc>
+        <w:tc>
+          <w:tcPr/>
+          <w:p>
+            <w:pPr>
+              <w:pStyle w:val="Compact"/>
+              <w:jc w:val="left"/>
+            </w:pPr>
+            <w:r>
+              <w:t xml:space="preserve">DDL boilerplate:</w:t>
+            </w:r>
+            <w:r>
+              <w:t xml:space="preserve"> </w:t>
+            </w:r>
+            <w:r>
+              <w:rPr>
+                <w:rStyle w:val="VerbatimChar"/>
+              </w:rPr>
+              <w:t xml:space="preserve">ENGINE=InnoDB</w:t>
+            </w:r>
+            <w:r>
+              <w:t xml:space="preserve">, FK syntax,</w:t>
+            </w:r>
+            <w:r>
+              <w:t xml:space="preserve"> </w:t>
+            </w:r>
+            <w:r>
+              <w:rPr>
+                <w:rStyle w:val="VerbatimChar"/>
+              </w:rPr>
+              <w:t xml:space="preserve">ENUM</w:t>
+            </w:r>
+            <w:r>
+              <w:t xml:space="preserve"> </w:t>
+            </w:r>
+            <w:r>
+              <w:t xml:space="preserve">declarations</w:t>
+            </w:r>
+          </w:p>
+        </w:tc>
+        <w:tc>
+          <w:tcPr/>
+          <w:p>
+            <w:pPr>
+              <w:pStyle w:val="Compact"/>
+              <w:jc w:val="left"/>
+            </w:pPr>
+            <w:r>
+              <w:t xml:space="preserve">Relation list, attribute types, key/UNIQUE/CHECK constraints, FK naming convention</w:t>
+            </w:r>
+          </w:p>
+        </w:tc>
+      </w:tr>
+      <w:tr>
+        <w:tc>
+          <w:tcPr/>
+          <w:p>
+            <w:pPr>
+              <w:pStyle w:val="Compact"/>
+              <w:jc w:val="left"/>
+            </w:pPr>
+            <w:r>
+              <w:rPr>
+                <w:rStyle w:val="VerbatimChar"/>
+              </w:rPr>
+              <w:t xml:space="preserve">sample_data.sql</w:t>
+            </w:r>
+            <w:r>
+              <w:t xml:space="preserve"> </w:t>
+            </w:r>
+            <w:r>
+              <w:t xml:space="preserve">(125</w:t>
+            </w:r>
+            <w:r>
+              <w:t xml:space="preserve"> </w:t>
+            </w:r>
+            <w:r>
+              <w:rPr>
+                <w:rStyle w:val="VerbatimChar"/>
+              </w:rPr>
+              <w:t xml:space="preserve">INSERT</w:t>
+            </w:r>
+            <w:r>
+              <w:t xml:space="preserve"> </w:t>
+            </w:r>
+            <w:r>
+              <w:t xml:space="preserve">rows)</w:t>
+            </w:r>
+          </w:p>
+        </w:tc>
+        <w:tc>
+          <w:tcPr/>
+          <w:p>
+            <w:pPr>
+              <w:pStyle w:val="Compact"/>
+              <w:jc w:val="left"/>
+            </w:pPr>
+            <w:r>
+              <w:t xml:space="preserve">Row-by-row INSERT typing</w:t>
+            </w:r>
+          </w:p>
+        </w:tc>
+        <w:tc>
+          <w:tcPr/>
+          <w:p>
+            <w:pPr>
+              <w:pStyle w:val="Compact"/>
+              <w:jc w:val="left"/>
+            </w:pPr>
+            <w:r>
+              <w:t xml:space="preserve">Edge-case matrix (repeat guests, cancellations, multi-room, partial deposits, NULL completion)</w:t>
+            </w:r>
+          </w:p>
+        </w:tc>
+      </w:tr>
+      <w:tr>
+        <w:tc>
+          <w:tcPr/>
+          <w:p>
+            <w:pPr>
+              <w:pStyle w:val="Compact"/>
+              <w:jc w:val="left"/>
+            </w:pPr>
+            <w:r>
+              <w:rPr>
+                <w:rStyle w:val="VerbatimChar"/>
+              </w:rPr>
+              <w:t xml:space="preserve">generate_figures.py</w:t>
+            </w:r>
+            <w:r>
+              <w:t xml:space="preserve"> </w:t>
+            </w:r>
+            <w:r>
+              <w:t xml:space="preserve">(10 charts)</w:t>
+            </w:r>
+          </w:p>
+        </w:tc>
+        <w:tc>
+          <w:tcPr/>
+          <w:p>
+            <w:pPr>
+              <w:pStyle w:val="Compact"/>
+              <w:jc w:val="left"/>
+            </w:pPr>
+            <w:r>
+              <w:t xml:space="preserve">matplotlib/seaborn boilerplate for violin, Sankey, raincloud, lollipop, heatmap, ridge, stacked-bar, radar, CDF</w:t>
+            </w:r>
+          </w:p>
+        </w:tc>
+        <w:tc>
+          <w:tcPr/>
+          <w:p>
+            <w:pPr>
+              <w:pStyle w:val="Compact"/>
+              <w:jc w:val="left"/>
+            </w:pPr>
+            <w:r>
+              <w:t xml:space="preserve">Chart type selection, palette choice, titles, captions, data-fidelity verification</w:t>
+            </w:r>
+          </w:p>
+        </w:tc>
+      </w:tr>
+      <w:tr>
+        <w:tc>
+          <w:tcPr/>
+          <w:p>
+            <w:pPr>
+              <w:pStyle w:val="Compact"/>
+              <w:jc w:val="left"/>
+            </w:pPr>
+            <w:r>
+              <w:t xml:space="preserve">Chinese</w:t>
+            </w:r>
+            <m:oMath>
+              <m:r>
+                <m:rPr>
+                  <m:sty m:val="p"/>
+                </m:rPr>
+                <m:t>→</m:t>
+              </m:r>
+            </m:oMath>
+            <w:r>
+              <w:t xml:space="preserve">English translation</w:t>
+            </w:r>
+          </w:p>
+        </w:tc>
+        <w:tc>
+          <w:tcPr/>
+          <w:p>
+            <w:pPr>
+              <w:pStyle w:val="Compact"/>
+              <w:jc w:val="left"/>
+            </w:pPr>
+            <w:r>
+              <w:t xml:space="preserve">4 prose segments converted to academic English</w:t>
+            </w:r>
+          </w:p>
+        </w:tc>
+        <w:tc>
+          <w:tcPr/>
+          <w:p>
+            <w:pPr>
+              <w:pStyle w:val="Compact"/>
+              <w:jc w:val="left"/>
+            </w:pPr>
+            <w:r>
+              <w:t xml:space="preserve">Original Chinese design notes; verification of preserved technical meaning</w:t>
+            </w:r>
+          </w:p>
+        </w:tc>
+      </w:tr>
+      <w:tr>
+        <w:tc>
+          <w:tcPr/>
+          <w:p>
+            <w:pPr>
+              <w:pStyle w:val="Compact"/>
+              <w:jc w:val="left"/>
+            </w:pPr>
+            <w:r>
+              <w:t xml:space="preserve">Codex independent review</w:t>
+            </w:r>
+          </w:p>
+        </w:tc>
+        <w:tc>
+          <w:tcPr/>
+          <w:p>
+            <w:pPr>
+              <w:pStyle w:val="Compact"/>
+              <w:jc w:val="left"/>
+            </w:pPr>
+            <w:r>
+              <w:t xml:space="preserve">Surfaced 7 mechanical bugs (ENUM mismatches, missing CHECK, LEFT JOIN filter placement)</w:t>
+            </w:r>
+          </w:p>
+        </w:tc>
+        <w:tc>
+          <w:tcPr/>
+          <w:p>
+            <w:pPr>
+              <w:pStyle w:val="Compact"/>
+              <w:jc w:val="left"/>
+            </w:pPr>
+            <w:r>
+              <w:t xml:space="preserve">Read each finding, decided fix vs. accept, applied edits</w:t>
+            </w:r>
+          </w:p>
+        </w:tc>
+      </w:tr>
+    </w:tbl>
+    <w:bookmarkEnd w:id="51"/>
+    <w:bookmarkStart w:id="52" w:name="verification-and-final-authorship"/>
+    <w:p>
+      <w:pPr>
+        <w:pStyle w:val="Heading1"/>
+      </w:pPr>
+      <w:r>
+        <w:t xml:space="preserve">Verification and Final Authorship</w:t>
+      </w:r>
+    </w:p>
+    <w:p>
+      <w:pPr>
+        <w:pStyle w:val="FirstParagraph"/>
+      </w:pPr>
+      <w:r>
+        <w:t xml:space="preserve">Every AI-produced artefact was (i) read line-by-line by a group member;</w:t>
+      </w:r>
+      <w:r>
+        <w:t xml:space="preserve"> </w:t>
+      </w:r>
+      <w:r>
+        <w:t xml:space="preserve">(ii) executed against MySQL 8.0 (the 12 query results in</w:t>
+      </w:r>
+      <w:r>
+        <w:t xml:space="preserve"> </w:t>
+      </w:r>
+      <w:r>
+        <w:rPr>
+          <w:rStyle w:val="VerbatimChar"/>
+        </w:rPr>
+        <w:t xml:space="preserve">result/query_outputs/</w:t>
+      </w:r>
+      <w:r>
+        <w:t xml:space="preserve"> </w:t>
+      </w:r>
+      <w:r>
+        <w:t xml:space="preserve">are evidence); (iii) modified where the</w:t>
+      </w:r>
+      <w:r>
+        <w:t xml:space="preserve"> </w:t>
+      </w:r>
+      <w:r>
+        <w:t xml:space="preserve">suggestion did not fit the design (e.g. Q5 enum correction</w:t>
+      </w:r>
+      <w:r>
+        <w:t xml:space="preserve"> </w:t>
+      </w:r>
+      <w:r>
+        <w:rPr>
+          <w:rStyle w:val="VerbatimChar"/>
+        </w:rPr>
+        <w:t xml:space="preserve">Out_of_Service</w:t>
+      </w:r>
+      <w:r>
+        <w:t xml:space="preserve"> </w:t>
+      </w:r>
+      <m:oMath>
+        <m:r>
+          <m:rPr>
+            <m:sty m:val="p"/>
+          </m:rPr>
+          <m:t>→</m:t>
+        </m:r>
+      </m:oMath>
+      <w:r>
+        <w:t xml:space="preserve"> </w:t>
+      </w:r>
+      <w:r>
+        <w:rPr>
+          <w:rStyle w:val="VerbatimChar"/>
+        </w:rPr>
+        <w:t xml:space="preserve">Maintenance</w:t>
+      </w:r>
+      <w:r>
+        <w:t xml:space="preserve">; Q11 tier</w:t>
+      </w:r>
+      <w:r>
+        <w:t xml:space="preserve"> </w:t>
+      </w:r>
+      <w:r>
+        <w:rPr>
+          <w:rStyle w:val="VerbatimChar"/>
+        </w:rPr>
+        <w:t xml:space="preserve">Diamond</w:t>
+      </w:r>
+      <w:r>
+        <w:t xml:space="preserve"> </w:t>
+      </w:r>
+      <m:oMath>
+        <m:r>
+          <m:rPr>
+            <m:sty m:val="p"/>
+          </m:rPr>
+          <m:t>→</m:t>
+        </m:r>
+      </m:oMath>
+      <w:r>
+        <w:t xml:space="preserve"> </w:t>
+      </w:r>
+      <w:r>
+        <w:rPr>
+          <w:rStyle w:val="VerbatimChar"/>
+        </w:rPr>
+        <w:t xml:space="preserve">Platinum</w:t>
+      </w:r>
+      <w:r>
+        <w:t xml:space="preserve">); (iv) documented in this appendix.</w:t>
+      </w:r>
+      <w:r>
+        <w:t xml:space="preserve"> </w:t>
+      </w:r>
+      <w:r>
+        <w:t xml:space="preserve">Final responsibility for correctness, design choices, and academic</w:t>
+      </w:r>
+      <w:r>
+        <w:t xml:space="preserve"> </w:t>
+      </w:r>
+      <w:r>
+        <w:t xml:space="preserve">integrity rests with the seven group members.</w:t>
+      </w:r>
+    </w:p>
+    <w:bookmarkEnd w:id="52"/>
+    <w:bookmarkStart w:id="95" w:name="X2e083f2f63569fa505853286d9e43a9440a934f"/>
+    <w:p>
+      <w:pPr>
+        <w:pStyle w:val="Heading1"/>
+      </w:pPr>
+      <w:r>
+        <w:t xml:space="preserve">Representative Prompts and Outputs (Screenshots)</w:t>
+      </w:r>
+    </w:p>
+    <w:p>
+      <w:pPr>
+        <w:pStyle w:val="FirstParagraph"/>
+      </w:pPr>
+      <w:r>
+        <w:t xml:space="preserve">The six prompt/output pairs below cover every category of AI use disclosed</w:t>
+      </w:r>
+      <w:r>
+        <w:t xml:space="preserve"> </w:t>
+      </w:r>
+      <w:r>
+        <w:t xml:space="preserve">in Sections B and C. Each screenshot is a verbatim terminal capture; the</w:t>
+      </w:r>
+      <w:r>
+        <w:t xml:space="preserve"> </w:t>
+      </w:r>
+      <w:r>
+        <w:t xml:space="preserve">model name appears in the upper-right window-tag of every capture.</w:t>
+      </w:r>
+    </w:p>
+    <w:bookmarkStart w:id="59" w:name="Xd0808a4d0024995d6216952daa136b52fa7c2f5"/>
+    <w:p>
+      <w:pPr>
+        <w:pStyle w:val="Heading2"/>
+      </w:pPr>
+      <w:r>
+        <w:t xml:space="preserve">Pair 1 – Schema scaffolding (</w:t>
+      </w:r>
+      <w:r>
+        <w:rPr>
+          <w:rStyle w:val="VerbatimChar"/>
+        </w:rPr>
+        <w:t xml:space="preserve">CREATE TABLE</w:t>
+      </w:r>
+      <w:r>
+        <w:t xml:space="preserve"> </w:t>
+      </w:r>
+      <w:r>
+        <w:t xml:space="preserve">boilerplate)</w:t>
+      </w:r>
+    </w:p>
+    <w:p>
+      <w:pPr>
+        <w:pStyle w:val="FirstParagraph"/>
+      </w:pPr>
+      <w:r>
+        <w:t xml:space="preserve">Tool: Claude Code, model: Claude Opus 4.7. Purpose: generate the</w:t>
+      </w:r>
+      <w:r>
+        <w:t xml:space="preserve"> </w:t>
+      </w:r>
+      <w:r>
+        <w:t xml:space="preserve">11-table</w:t>
+      </w:r>
+      <w:r>
+        <w:t xml:space="preserve"> </w:t>
+      </w:r>
+      <w:r>
+        <w:rPr>
+          <w:rStyle w:val="VerbatimChar"/>
+        </w:rPr>
+        <w:t xml:space="preserve">init.sql</w:t>
+      </w:r>
+      <w:r>
+        <w:t xml:space="preserve"> </w:t>
+      </w:r>
+      <w:r>
+        <w:t xml:space="preserve">from a human-written relation list.</w:t>
+      </w:r>
+    </w:p>
+    <w:tbl>
+      <w:tblPr>
+        <w:tblStyle w:val="FigureTable"/>
+        <w:tblW w:type="auto" w:w="0"/>
+        <w:jc w:val="center"/>
+        <w:tblLook w:firstRow="0" w:lastRow="0" w:firstColumn="0" w:lastColumn="0"/>
+      </w:tblPr>
+      <w:tblGrid>
+        <w:gridCol w:w="7920"/>
+      </w:tblGrid>
+      <w:tr>
+        <w:tc>
+          <w:tcPr/>
+          <w:p>
+            <w:pPr>
+              <w:jc w:val="center"/>
+            </w:pPr>
+            <w:r>
+              <w:drawing>
+                <wp:inline>
+                  <wp:extent cx="5067300" cy="4709818"/>
+                  <wp:effectExtent b="0" l="0" r="0" t="0"/>
+                  <wp:docPr descr="image" title="" id="54" name="Picture"/>
+                  <a:graphic>
+                    <a:graphicData uri="http://schemas.openxmlformats.org/drawingml/2006/picture">
+                      <pic:pic>
+                        <pic:nvPicPr>
+                          <pic:cNvPr descr="../../genai_appendix/prompt_01.png" id="55" name="Picture"/>
+                          <pic:cNvPicPr>
+                            <a:picLocks noChangeArrowheads="1" noChangeAspect="1"/>
+                          </pic:cNvPicPr>
+                        </pic:nvPicPr>
+                        <pic:blipFill>
+                          <a:blip r:embed="rId53"/>
+                          <a:stretch>
+                            <a:fillRect/>
+                          </a:stretch>
+                        </pic:blipFill>
+                        <pic:spPr bwMode="auto">
+                          <a:xfrm>
+                            <a:off x="0" y="0"/>
+                            <a:ext cx="5067300" cy="4709818"/>
+                          </a:xfrm>
+                          <a:prstGeom prst="rect">
+                            <a:avLst/>
+                          </a:prstGeom>
+                          <a:noFill/>
+                          <a:ln w="9525">
+                            <a:noFill/>
+                            <a:headEnd/>
+                            <a:tailEnd/>
+                          </a:ln>
+                        </pic:spPr>
+                      </pic:pic>
+                    </a:graphicData>
+                  </a:graphic>
+                </wp:inline>
+              </w:drawing>
+            </w:r>
+            <w:r>
+              <w:br/>
+            </w:r>
+            <w:r>
+              <w:drawing>
+                <wp:inline>
+                  <wp:extent cx="5067300" cy="5304131"/>
+                  <wp:effectExtent b="0" l="0" r="0" t="0"/>
+                  <wp:docPr descr="image" title="" id="57" name="Picture"/>
+                  <a:graphic>
+                    <a:graphicData uri="http://schemas.openxmlformats.org/drawingml/2006/picture">
+                      <pic:pic>
+                        <pic:nvPicPr>
+                          <pic:cNvPr descr="../../genai_appendix/output_01.png" id="58" name="Picture"/>
+                          <pic:cNvPicPr>
+                            <a:picLocks noChangeArrowheads="1" noChangeAspect="1"/>
+                          </pic:cNvPicPr>
+                        </pic:nvPicPr>
+                        <pic:blipFill>
+                          <a:blip r:embed="rId56"/>
+                          <a:stretch>
+                            <a:fillRect/>
+                          </a:stretch>
+                        </pic:blipFill>
+                        <pic:spPr bwMode="auto">
+                          <a:xfrm>
+                            <a:off x="0" y="0"/>
+                            <a:ext cx="5067300" cy="5304131"/>
+                          </a:xfrm>
+                          <a:prstGeom prst="rect">
+                            <a:avLst/>
+                          </a:prstGeom>
+                          <a:noFill/>
+                          <a:ln w="9525">
+                            <a:noFill/>
+                            <a:headEnd/>
+                            <a:tailEnd/>
+                          </a:ln>
+                        </pic:spPr>
+                      </pic:pic>
+                    </a:graphicData>
+                  </a:graphic>
+                </wp:inline>
+              </w:drawing>
+            </w:r>
+          </w:p>
+        </w:tc>
+      </w:tr>
+    </w:tbl>
+    <w:bookmarkEnd w:id="59"/>
+    <w:bookmarkStart w:id="66" w:name="X70e2ee0287e53f5bffdc18ec5cddb4b5d014f0b"/>
+    <w:p>
+      <w:pPr>
+        <w:pStyle w:val="Heading2"/>
+      </w:pPr>
+      <w:r>
+        <w:t xml:space="preserve">Pair 2 – Sample data rows (</w:t>
+      </w:r>
+      <w:r>
+        <w:rPr>
+          <w:rStyle w:val="VerbatimChar"/>
+        </w:rPr>
+        <w:t xml:space="preserve">INSERT</w:t>
+      </w:r>
+      <w:r>
+        <w:t xml:space="preserve"> </w:t>
+      </w:r>
+      <w:r>
+        <w:t xml:space="preserve">boilerplate)</w:t>
+      </w:r>
+    </w:p>
+    <w:p>
+      <w:pPr>
+        <w:pStyle w:val="FirstParagraph"/>
+      </w:pPr>
+      <w:r>
+        <w:t xml:space="preserve">Tool: Claude Code, model: Claude Opus 4.7. Purpose: produce</w:t>
+      </w:r>
+      <w:r>
+        <w:t xml:space="preserve"> </w:t>
+      </w:r>
+      <w:r>
+        <w:t xml:space="preserve">edge-case-rich INSERT rows under a human-written specification.</w:t>
+      </w:r>
+    </w:p>
+    <w:tbl>
+      <w:tblPr>
+        <w:tblStyle w:val="FigureTable"/>
+        <w:tblW w:type="auto" w:w="0"/>
+        <w:jc w:val="center"/>
+        <w:tblLook w:firstRow="0" w:lastRow="0" w:firstColumn="0" w:lastColumn="0"/>
+      </w:tblPr>
+      <w:tblGrid>
+        <w:gridCol w:w="7920"/>
+      </w:tblGrid>
+      <w:tr>
+        <w:tc>
+          <w:tcPr/>
+          <w:p>
+            <w:pPr>
+              <w:jc w:val="center"/>
+            </w:pPr>
+            <w:r>
+              <w:drawing>
+                <wp:inline>
+                  <wp:extent cx="5067300" cy="4316588"/>
+                  <wp:effectExtent b="0" l="0" r="0" t="0"/>
+                  <wp:docPr descr="image" title="" id="61" name="Picture"/>
+                  <a:graphic>
+                    <a:graphicData uri="http://schemas.openxmlformats.org/drawingml/2006/picture">
+                      <pic:pic>
+                        <pic:nvPicPr>
+                          <pic:cNvPr descr="../../genai_appendix/prompt_02.png" id="62" name="Picture"/>
+                          <pic:cNvPicPr>
+                            <a:picLocks noChangeArrowheads="1" noChangeAspect="1"/>
+                          </pic:cNvPicPr>
+                        </pic:nvPicPr>
+                        <pic:blipFill>
+                          <a:blip r:embed="rId60"/>
+                          <a:stretch>
+                            <a:fillRect/>
+                          </a:stretch>
+                        </pic:blipFill>
+                        <pic:spPr bwMode="auto">
+                          <a:xfrm>
+                            <a:off x="0" y="0"/>
+                            <a:ext cx="5067300" cy="4316588"/>
+                          </a:xfrm>
+                          <a:prstGeom prst="rect">
+                            <a:avLst/>
+                          </a:prstGeom>
+                          <a:noFill/>
+                          <a:ln w="9525">
+                            <a:noFill/>
+                            <a:headEnd/>
+                            <a:tailEnd/>
+                          </a:ln>
+                        </pic:spPr>
+                      </pic:pic>
+                    </a:graphicData>
+                  </a:graphic>
+                </wp:inline>
+              </w:drawing>
+            </w:r>
+            <w:r>
+              <w:br/>
+            </w:r>
+            <w:r>
+              <w:drawing>
+                <wp:inline>
+                  <wp:extent cx="5067300" cy="4513203"/>
+                  <wp:effectExtent b="0" l="0" r="0" t="0"/>
+                  <wp:docPr descr="image" title="" id="64" name="Picture"/>
+                  <a:graphic>
+                    <a:graphicData uri="http://schemas.openxmlformats.org/drawingml/2006/picture">
+                      <pic:pic>
+                        <pic:nvPicPr>
+                          <pic:cNvPr descr="../../genai_appendix/output_02.png" id="65" name="Picture"/>
+                          <pic:cNvPicPr>
+                            <a:picLocks noChangeArrowheads="1" noChangeAspect="1"/>
+                          </pic:cNvPicPr>
+                        </pic:nvPicPr>
+                        <pic:blipFill>
+                          <a:blip r:embed="rId63"/>
+                          <a:stretch>
+                            <a:fillRect/>
+                          </a:stretch>
+                        </pic:blipFill>
+                        <pic:spPr bwMode="auto">
+                          <a:xfrm>
+                            <a:off x="0" y="0"/>
+                            <a:ext cx="5067300" cy="4513203"/>
+                          </a:xfrm>
+                          <a:prstGeom prst="rect">
+                            <a:avLst/>
+                          </a:prstGeom>
+                          <a:noFill/>
+                          <a:ln w="9525">
+                            <a:noFill/>
+                            <a:headEnd/>
+                            <a:tailEnd/>
+                          </a:ln>
+                        </pic:spPr>
+                      </pic:pic>
+                    </a:graphicData>
+                  </a:graphic>
+                </wp:inline>
+              </w:drawing>
+            </w:r>
+          </w:p>
+        </w:tc>
+      </w:tr>
+    </w:tbl>
+    <w:bookmarkEnd w:id="66"/>
+    <w:bookmarkStart w:id="73" w:name="pair-3-chinesetoenglish-translation"/>
+    <w:p>
+      <w:pPr>
+        <w:pStyle w:val="Heading2"/>
+      </w:pPr>
+      <w:r>
+        <w:t xml:space="preserve">Pair 3 – Chinese</w:t>
+      </w:r>
+      <m:oMath>
+        <m:r>
+          <m:rPr>
+            <m:sty m:val="p"/>
+          </m:rPr>
+          <m:t>→</m:t>
+        </m:r>
+      </m:oMath>
+      <w:r>
+        <w:t xml:space="preserve">English translation</w:t>
+      </w:r>
+    </w:p>
+    <w:p>
+      <w:pPr>
+        <w:pStyle w:val="FirstParagraph"/>
+      </w:pPr>
+      <w:r>
+        <w:t xml:space="preserve">Tool: Claude Code, model: Claude Opus 4.7. Purpose: translate</w:t>
+      </w:r>
+      <w:r>
+        <w:t xml:space="preserve"> </w:t>
+      </w:r>
+      <w:r>
+        <w:t xml:space="preserve">Chinese brainstorm notes into academic English for the report.</w:t>
+      </w:r>
+    </w:p>
+    <w:tbl>
+      <w:tblPr>
+        <w:tblStyle w:val="FigureTable"/>
+        <w:tblW w:type="auto" w:w="0"/>
+        <w:jc w:val="center"/>
+        <w:tblLook w:firstRow="0" w:lastRow="0" w:firstColumn="0" w:lastColumn="0"/>
+      </w:tblPr>
+      <w:tblGrid>
+        <w:gridCol w:w="7920"/>
+      </w:tblGrid>
+      <w:tr>
+        <w:tc>
+          <w:tcPr/>
+          <w:p>
+            <w:pPr>
+              <w:jc w:val="center"/>
+            </w:pPr>
+            <w:r>
+              <w:drawing>
+                <wp:inline>
+                  <wp:extent cx="5067300" cy="3717807"/>
+                  <wp:effectExtent b="0" l="0" r="0" t="0"/>
+                  <wp:docPr descr="image" title="" id="68" name="Picture"/>
+                  <a:graphic>
+                    <a:graphicData uri="http://schemas.openxmlformats.org/drawingml/2006/picture">
+                      <pic:pic>
+                        <pic:nvPicPr>
+                          <pic:cNvPr descr="../../genai_appendix/prompt_03.png" id="69" name="Picture"/>
+                          <pic:cNvPicPr>
+                            <a:picLocks noChangeArrowheads="1" noChangeAspect="1"/>
+                          </pic:cNvPicPr>
+                        </pic:nvPicPr>
+                        <pic:blipFill>
+                          <a:blip r:embed="rId67"/>
+                          <a:stretch>
+                            <a:fillRect/>
+                          </a:stretch>
+                        </pic:blipFill>
+                        <pic:spPr bwMode="auto">
+                          <a:xfrm>
+                            <a:off x="0" y="0"/>
+                            <a:ext cx="5067300" cy="3717807"/>
+                          </a:xfrm>
+                          <a:prstGeom prst="rect">
+                            <a:avLst/>
+                          </a:prstGeom>
+                          <a:noFill/>
+                          <a:ln w="9525">
+                            <a:noFill/>
+                            <a:headEnd/>
+                            <a:tailEnd/>
+                          </a:ln>
+                        </pic:spPr>
+                      </pic:pic>
+                    </a:graphicData>
+                  </a:graphic>
+                </wp:inline>
+              </w:drawing>
+            </w:r>
+            <w:r>
+              <w:br/>
+            </w:r>
+            <w:r>
+              <w:drawing>
+                <wp:inline>
+                  <wp:extent cx="5067300" cy="4709818"/>
+                  <wp:effectExtent b="0" l="0" r="0" t="0"/>
+                  <wp:docPr descr="image" title="" id="71" name="Picture"/>
+                  <a:graphic>
+                    <a:graphicData uri="http://schemas.openxmlformats.org/drawingml/2006/picture">
+                      <pic:pic>
+                        <pic:nvPicPr>
+                          <pic:cNvPr descr="../../genai_appendix/output_03.png" id="72" name="Picture"/>
+                          <pic:cNvPicPr>
+                            <a:picLocks noChangeArrowheads="1" noChangeAspect="1"/>
+                          </pic:cNvPicPr>
+                        </pic:nvPicPr>
+                        <pic:blipFill>
+                          <a:blip r:embed="rId70"/>
+                          <a:stretch>
+                            <a:fillRect/>
+                          </a:stretch>
+                        </pic:blipFill>
+                        <pic:spPr bwMode="auto">
+                          <a:xfrm>
+                            <a:off x="0" y="0"/>
+                            <a:ext cx="5067300" cy="4709818"/>
+                          </a:xfrm>
+                          <a:prstGeom prst="rect">
+                            <a:avLst/>
+                          </a:prstGeom>
+                          <a:noFill/>
+                          <a:ln w="9525">
+                            <a:noFill/>
+                            <a:headEnd/>
+                            <a:tailEnd/>
+                          </a:ln>
+                        </pic:spPr>
+                      </pic:pic>
+                    </a:graphicData>
+                  </a:graphic>
+                </wp:inline>
+              </w:drawing>
+            </w:r>
+          </w:p>
+        </w:tc>
+      </w:tr>
+    </w:tbl>
+    <w:bookmarkEnd w:id="73"/>
+    <w:bookmarkStart w:id="80" w:name="pair-4-independent-code-review"/>
+    <w:p>
+      <w:pPr>
+        <w:pStyle w:val="Heading2"/>
+      </w:pPr>
+      <w:r>
+        <w:t xml:space="preserve">Pair 4 – Independent code review</w:t>
+      </w:r>
+    </w:p>
+    <w:p>
+      <w:pPr>
+        <w:pStyle w:val="FirstParagraph"/>
+      </w:pPr>
+      <w:r>
+        <w:t xml:space="preserve">Tool: Codex CLI (consult mode), model: GPT-5.4 via Codex CLI</w:t>
+      </w:r>
+      <w:r>
+        <w:t xml:space="preserve"> </w:t>
+      </w:r>
+      <w:r>
+        <w:t xml:space="preserve">0.128.0. Purpose: adversarial review of SQL queries and Python agent for</w:t>
+      </w:r>
+      <w:r>
+        <w:t xml:space="preserve"> </w:t>
+      </w:r>
+      <w:r>
+        <w:t xml:space="preserve">mechanical bugs.</w:t>
+      </w:r>
+    </w:p>
+    <w:tbl>
+      <w:tblPr>
+        <w:tblStyle w:val="FigureTable"/>
+        <w:tblW w:type="auto" w:w="0"/>
+        <w:jc w:val="center"/>
+        <w:tblLook w:firstRow="0" w:lastRow="0" w:firstColumn="0" w:lastColumn="0"/>
+      </w:tblPr>
+      <w:tblGrid>
+        <w:gridCol w:w="7920"/>
+      </w:tblGrid>
+      <w:tr>
+        <w:tc>
+          <w:tcPr/>
+          <w:p>
+            <w:pPr>
+              <w:jc w:val="center"/>
+            </w:pPr>
+            <w:r>
+              <w:drawing>
+                <wp:inline>
+                  <wp:extent cx="5067300" cy="4115505"/>
+                  <wp:effectExtent b="0" l="0" r="0" t="0"/>
+                  <wp:docPr descr="image" title="" id="75" name="Picture"/>
+                  <a:graphic>
+                    <a:graphicData uri="http://schemas.openxmlformats.org/drawingml/2006/picture">
+                      <pic:pic>
+                        <pic:nvPicPr>
+                          <pic:cNvPr descr="../../genai_appendix/prompt_04.png" id="76" name="Picture"/>
+                          <pic:cNvPicPr>
+                            <a:picLocks noChangeArrowheads="1" noChangeAspect="1"/>
+                          </pic:cNvPicPr>
+                        </pic:nvPicPr>
+                        <pic:blipFill>
+                          <a:blip r:embed="rId74"/>
+                          <a:stretch>
+                            <a:fillRect/>
+                          </a:stretch>
+                        </pic:blipFill>
+                        <pic:spPr bwMode="auto">
+                          <a:xfrm>
+                            <a:off x="0" y="0"/>
+                            <a:ext cx="5067300" cy="4115505"/>
+                          </a:xfrm>
+                          <a:prstGeom prst="rect">
+                            <a:avLst/>
+                          </a:prstGeom>
+                          <a:noFill/>
+                          <a:ln w="9525">
+                            <a:noFill/>
+                            <a:headEnd/>
+                            <a:tailEnd/>
+                          </a:ln>
+                        </pic:spPr>
+                      </pic:pic>
+                    </a:graphicData>
+                  </a:graphic>
+                </wp:inline>
+              </w:drawing>
+            </w:r>
+            <w:r>
+              <w:br/>
+            </w:r>
+            <w:r>
+              <w:drawing>
+                <wp:inline>
+                  <wp:extent cx="5067300" cy="6693840"/>
+                  <wp:effectExtent b="0" l="0" r="0" t="0"/>
+                  <wp:docPr descr="image" title="" id="78" name="Picture"/>
+                  <a:graphic>
+                    <a:graphicData uri="http://schemas.openxmlformats.org/drawingml/2006/picture">
+                      <pic:pic>
+                        <pic:nvPicPr>
+                          <pic:cNvPr descr="../../genai_appendix/output_04.png" id="79" name="Picture"/>
+                          <pic:cNvPicPr>
+                            <a:picLocks noChangeArrowheads="1" noChangeAspect="1"/>
+                          </pic:cNvPicPr>
+                        </pic:nvPicPr>
+                        <pic:blipFill>
+                          <a:blip r:embed="rId77"/>
+                          <a:stretch>
+                            <a:fillRect/>
+                          </a:stretch>
+                        </pic:blipFill>
+                        <pic:spPr bwMode="auto">
+                          <a:xfrm>
+                            <a:off x="0" y="0"/>
+                            <a:ext cx="5067300" cy="6693840"/>
+                          </a:xfrm>
+                          <a:prstGeom prst="rect">
+                            <a:avLst/>
+                          </a:prstGeom>
+                          <a:noFill/>
+                          <a:ln w="9525">
+                            <a:noFill/>
+                            <a:headEnd/>
+                            <a:tailEnd/>
+                          </a:ln>
+                        </pic:spPr>
+                      </pic:pic>
+                    </a:graphicData>
+                  </a:graphic>
+                </wp:inline>
+              </w:drawing>
+            </w:r>
+          </w:p>
+        </w:tc>
+      </w:tr>
+    </w:tbl>
+    <w:bookmarkEnd w:id="80"/>
+    <w:bookmarkStart w:id="87" w:name="Xf74a4be2164950adc3ce53be3ddae0d89808d8d"/>
+    <w:p>
+      <w:pPr>
+        <w:pStyle w:val="Heading2"/>
+      </w:pPr>
+      <w:r>
+        <w:t xml:space="preserve">Pair 5 – Violin-plot matplotlib boilerplate</w:t>
+      </w:r>
+    </w:p>
+    <w:p>
+      <w:pPr>
+        <w:pStyle w:val="FirstParagraph"/>
+      </w:pPr>
+      <w:r>
+        <w:t xml:space="preserve">Tool: Claude Code, model: Claude Opus 4.7. Purpose: write the</w:t>
+      </w:r>
+      <w:r>
+        <w:t xml:space="preserve"> </w:t>
+      </w:r>
+      <w:r>
+        <w:t xml:space="preserve">seaborn violin-plot call signature for Figure </w:t>
+      </w:r>
+      <w:hyperlink w:anchor="fig:violin">
+        <w:r>
+          <w:rPr>
+            <w:rStyle w:val="Hyperlink"/>
+          </w:rPr>
+          <w:t xml:space="preserve">2</w:t>
+        </w:r>
+      </w:hyperlink>
+      <w:r>
+        <w:t xml:space="preserve">.</w:t>
+      </w:r>
+    </w:p>
+    <w:tbl>
+      <w:tblPr>
+        <w:tblStyle w:val="FigureTable"/>
+        <w:tblW w:type="auto" w:w="0"/>
+        <w:jc w:val="center"/>
+        <w:tblLook w:firstRow="0" w:lastRow="0" w:firstColumn="0" w:lastColumn="0"/>
+      </w:tblPr>
+      <w:tblGrid>
+        <w:gridCol w:w="7920"/>
+      </w:tblGrid>
+      <w:tr>
+        <w:tc>
+          <w:tcPr/>
+          <w:p>
+            <w:pPr>
+              <w:jc w:val="center"/>
+            </w:pPr>
+            <w:r>
+              <w:drawing>
+                <wp:inline>
+                  <wp:extent cx="5067300" cy="3909953"/>
+                  <wp:effectExtent b="0" l="0" r="0" t="0"/>
+                  <wp:docPr descr="image" title="" id="82" name="Picture"/>
+                  <a:graphic>
+                    <a:graphicData uri="http://schemas.openxmlformats.org/drawingml/2006/picture">
+                      <pic:pic>
+                        <pic:nvPicPr>
+                          <pic:cNvPr descr="../../genai_appendix/prompt_05.png" id="83" name="Picture"/>
+                          <pic:cNvPicPr>
+                            <a:picLocks noChangeArrowheads="1" noChangeAspect="1"/>
+                          </pic:cNvPicPr>
+                        </pic:nvPicPr>
+                        <pic:blipFill>
+                          <a:blip r:embed="rId81"/>
+                          <a:stretch>
+                            <a:fillRect/>
+                          </a:stretch>
+                        </pic:blipFill>
+                        <pic:spPr bwMode="auto">
+                          <a:xfrm>
+                            <a:off x="0" y="0"/>
+                            <a:ext cx="5067300" cy="3909953"/>
+                          </a:xfrm>
+                          <a:prstGeom prst="rect">
+                            <a:avLst/>
+                          </a:prstGeom>
+                          <a:noFill/>
+                          <a:ln w="9525">
+                            <a:noFill/>
+                            <a:headEnd/>
+                            <a:tailEnd/>
+                          </a:ln>
+                        </pic:spPr>
+                      </pic:pic>
+                    </a:graphicData>
+                  </a:graphic>
+                </wp:inline>
+              </w:drawing>
+            </w:r>
+            <w:r>
+              <w:br/>
+            </w:r>
+            <w:r>
+              <w:drawing>
+                <wp:inline>
+                  <wp:extent cx="5067300" cy="5304131"/>
+                  <wp:effectExtent b="0" l="0" r="0" t="0"/>
+                  <wp:docPr descr="image" title="" id="85" name="Picture"/>
+                  <a:graphic>
+                    <a:graphicData uri="http://schemas.openxmlformats.org/drawingml/2006/picture">
+                      <pic:pic>
+                        <pic:nvPicPr>
+                          <pic:cNvPr descr="../../genai_appendix/output_05.png" id="86" name="Picture"/>
+                          <pic:cNvPicPr>
+                            <a:picLocks noChangeArrowheads="1" noChangeAspect="1"/>
+                          </pic:cNvPicPr>
+                        </pic:nvPicPr>
+                        <pic:blipFill>
+                          <a:blip r:embed="rId84"/>
+                          <a:stretch>
+                            <a:fillRect/>
+                          </a:stretch>
+                        </pic:blipFill>
+                        <pic:spPr bwMode="auto">
+                          <a:xfrm>
+                            <a:off x="0" y="0"/>
+                            <a:ext cx="5067300" cy="5304131"/>
+                          </a:xfrm>
+                          <a:prstGeom prst="rect">
+                            <a:avLst/>
+                          </a:prstGeom>
+                          <a:noFill/>
+                          <a:ln w="9525">
+                            <a:noFill/>
+                            <a:headEnd/>
+                            <a:tailEnd/>
+                          </a:ln>
+                        </pic:spPr>
+                      </pic:pic>
+                    </a:graphicData>
+                  </a:graphic>
+                </wp:inline>
+              </w:drawing>
+            </w:r>
+          </w:p>
+        </w:tc>
+      </w:tr>
+    </w:tbl>
+    <w:bookmarkEnd w:id="87"/>
+    <w:bookmarkStart w:id="94" w:name="X83d73314f5d2708f954809e7e3357435145d007"/>
+    <w:p>
+      <w:pPr>
+        <w:pStyle w:val="Heading2"/>
+      </w:pPr>
+      <w:r>
+        <w:t xml:space="preserve">Pair 6 – Raincloud-plot three-layer construction</w:t>
+      </w:r>
+    </w:p>
+    <w:p>
+      <w:pPr>
+        <w:pStyle w:val="FirstParagraph"/>
+      </w:pPr>
+      <w:r>
+        <w:t xml:space="preserve">Tool: Claude Code, model: Claude Opus 4.7. Purpose: write the</w:t>
+      </w:r>
+      <w:r>
+        <w:t xml:space="preserve"> </w:t>
+      </w:r>
+      <w:r>
+        <w:t xml:space="preserve">half-violin + jittered scatter + boxplot composition used in</w:t>
+      </w:r>
+      <w:r>
+        <w:t xml:space="preserve"> </w:t>
+      </w:r>
+      <w:r>
+        <w:t xml:space="preserve">Figure </w:t>
+      </w:r>
+      <w:hyperlink w:anchor="fig:raincloud">
+        <w:r>
+          <w:rPr>
+            <w:rStyle w:val="Hyperlink"/>
+          </w:rPr>
+          <w:t xml:space="preserve">5</w:t>
+        </w:r>
+      </w:hyperlink>
+      <w:r>
+        <w:t xml:space="preserve">.</w:t>
+      </w:r>
+    </w:p>
+    <w:tbl>
+      <w:tblPr>
+        <w:tblStyle w:val="FigureTable"/>
+        <w:tblW w:type="auto" w:w="0"/>
+        <w:jc w:val="center"/>
+        <w:tblLook w:firstRow="0" w:lastRow="0" w:firstColumn="0" w:lastColumn="0"/>
+      </w:tblPr>
+      <w:tblGrid>
+        <w:gridCol w:w="7920"/>
+      </w:tblGrid>
+      <w:tr>
+        <w:tc>
+          <w:tcPr/>
+          <w:p>
+            <w:pPr>
+              <w:jc w:val="center"/>
+            </w:pPr>
+            <w:r>
+              <w:drawing>
+                <wp:inline>
+                  <wp:extent cx="5067300" cy="4115505"/>
+                  <wp:effectExtent b="0" l="0" r="0" t="0"/>
+                  <wp:docPr descr="image" title="" id="89" name="Picture"/>
+                  <a:graphic>
+                    <a:graphicData uri="http://schemas.openxmlformats.org/drawingml/2006/picture">
+                      <pic:pic>
+                        <pic:nvPicPr>
+                          <pic:cNvPr descr="../../genai_appendix/prompt_06.png" id="90" name="Picture"/>
+                          <pic:cNvPicPr>
+                            <a:picLocks noChangeArrowheads="1" noChangeAspect="1"/>
+                          </pic:cNvPicPr>
+                        </pic:nvPicPr>
+                        <pic:blipFill>
+                          <a:blip r:embed="rId88"/>
+                          <a:stretch>
+                            <a:fillRect/>
+                          </a:stretch>
+                        </pic:blipFill>
+                        <pic:spPr bwMode="auto">
+                          <a:xfrm>
+                            <a:off x="0" y="0"/>
+                            <a:ext cx="5067300" cy="4115505"/>
+                          </a:xfrm>
+                          <a:prstGeom prst="rect">
+                            <a:avLst/>
+                          </a:prstGeom>
+                          <a:noFill/>
+                          <a:ln w="9525">
+                            <a:noFill/>
+                            <a:headEnd/>
+                            <a:tailEnd/>
+                          </a:ln>
+                        </pic:spPr>
+                      </pic:pic>
+                    </a:graphicData>
+                  </a:graphic>
+                </wp:inline>
+              </w:drawing>
+            </w:r>
+            <w:r>
+              <w:br/>
+            </w:r>
+            <w:r>
+              <w:drawing>
+                <wp:inline>
+                  <wp:extent cx="5067300" cy="6693840"/>
+                  <wp:effectExtent b="0" l="0" r="0" t="0"/>
+                  <wp:docPr descr="image" title="" id="92" name="Picture"/>
+                  <a:graphic>
+                    <a:graphicData uri="http://schemas.openxmlformats.org/drawingml/2006/picture">
+                      <pic:pic>
+                        <pic:nvPicPr>
+                          <pic:cNvPr descr="../../genai_appendix/output_06.png" id="93" name="Picture"/>
+                          <pic:cNvPicPr>
+                            <a:picLocks noChangeArrowheads="1" noChangeAspect="1"/>
+                          </pic:cNvPicPr>
+                        </pic:nvPicPr>
+                        <pic:blipFill>
+                          <a:blip r:embed="rId91"/>
+                          <a:stretch>
+                            <a:fillRect/>
+                          </a:stretch>
+                        </pic:blipFill>
+                        <pic:spPr bwMode="auto">
+                          <a:xfrm>
+                            <a:off x="0" y="0"/>
+                            <a:ext cx="5067300" cy="6693840"/>
+                          </a:xfrm>
+                          <a:prstGeom prst="rect">
+                            <a:avLst/>
+                          </a:prstGeom>
+                          <a:noFill/>
+                          <a:ln w="9525">
+                            <a:noFill/>
+                            <a:headEnd/>
+                            <a:tailEnd/>
+                          </a:ln>
+                        </pic:spPr>
+                      </pic:pic>
+                    </a:graphicData>
+                  </a:graphic>
+                </wp:inline>
+              </w:drawing>
+            </w:r>
+          </w:p>
+        </w:tc>
+      </w:tr>
+    </w:tbl>
+    <w:bookmarkEnd w:id="94"/>
+    <w:bookmarkEnd w:id="95"/>
     <w:sectPr>
       <w:footnotePr>
         <w:numRestart w:val="eachSect"/>
@@ -4637,11 +6448,126 @@
       </w:rPr>
     </w:lvl>
   </w:abstractNum>
+  <w:abstractNum w:abstractNumId="99201">
+    <w:nsid w:val="00A99201"/>
+    <w:multiLevelType w:val="multilevel"/>
+    <w:lvl w:ilvl="0">
+      <w:start w:val="1"/>
+      <w:numFmt w:val="decimal"/>
+      <w:lvlText w:val="%1."/>
+      <w:lvlJc w:val="left"/>
+      <w:pPr>
+        <w:ind w:left="720" w:hanging="360"/>
+      </w:pPr>
+    </w:lvl>
+    <w:lvl w:ilvl="1">
+      <w:start w:val="1"/>
+      <w:numFmt w:val="lowerLetter"/>
+      <w:lvlText w:val="%2."/>
+      <w:lvlJc w:val="left"/>
+      <w:pPr>
+        <w:ind w:left="1440" w:hanging="360"/>
+      </w:pPr>
+    </w:lvl>
+    <w:lvl w:ilvl="2">
+      <w:start w:val="1"/>
+      <w:numFmt w:val="lowerRoman"/>
+      <w:lvlText w:val="%3."/>
+      <w:lvlJc w:val="left"/>
+      <w:pPr>
+        <w:ind w:left="2160" w:hanging="360"/>
+      </w:pPr>
+    </w:lvl>
+    <w:lvl w:ilvl="3">
+      <w:start w:val="1"/>
+      <w:numFmt w:val="decimal"/>
+      <w:lvlText w:val="%4."/>
+      <w:lvlJc w:val="left"/>
+      <w:pPr>
+        <w:ind w:left="2880" w:hanging="360"/>
+      </w:pPr>
+    </w:lvl>
+    <w:lvl w:ilvl="4">
+      <w:start w:val="1"/>
+      <w:numFmt w:val="lowerLetter"/>
+      <w:lvlText w:val="%5."/>
+      <w:lvlJc w:val="left"/>
+      <w:pPr>
+        <w:ind w:left="3600" w:hanging="360"/>
+      </w:pPr>
+    </w:lvl>
+    <w:lvl w:ilvl="5">
+      <w:start w:val="1"/>
+      <w:numFmt w:val="lowerRoman"/>
+      <w:lvlText w:val="%6."/>
+      <w:lvlJc w:val="left"/>
+      <w:pPr>
+        <w:ind w:left="4320" w:hanging="360"/>
+      </w:pPr>
+    </w:lvl>
+    <w:lvl w:ilvl="6">
+      <w:start w:val="1"/>
+      <w:numFmt w:val="decimal"/>
+      <w:lvlText w:val="%7."/>
+      <w:lvlJc w:val="left"/>
+      <w:pPr>
+        <w:ind w:left="5040" w:hanging="360"/>
+      </w:pPr>
+    </w:lvl>
+    <w:lvl w:ilvl="7">
+      <w:start w:val="1"/>
+      <w:numFmt w:val="lowerLetter"/>
+      <w:lvlText w:val="%8."/>
+      <w:lvlJc w:val="left"/>
+      <w:pPr>
+        <w:ind w:left="5760" w:hanging="360"/>
+      </w:pPr>
+    </w:lvl>
+    <w:lvl w:ilvl="8">
+      <w:start w:val="1"/>
+      <w:numFmt w:val="lowerRoman"/>
+      <w:lvlText w:val="%9."/>
+      <w:lvlJc w:val="left"/>
+      <w:pPr>
+        <w:ind w:left="6480" w:hanging="360"/>
+      </w:pPr>
+    </w:lvl>
+  </w:abstractNum>
   <w:num w:numId="1000">
     <w:abstractNumId w:val="990"/>
   </w:num>
   <w:num w:numId="1001">
     <w:abstractNumId w:val="991"/>
+  </w:num>
+  <w:num w:numId="1002">
+    <w:abstractNumId w:val="99201"/>
+    <w:lvlOverride w:ilvl="0">
+      <w:startOverride w:val="1"/>
+    </w:lvlOverride>
+    <w:lvlOverride w:ilvl="1">
+      <w:startOverride w:val="1"/>
+    </w:lvlOverride>
+    <w:lvlOverride w:ilvl="2">
+      <w:startOverride w:val="1"/>
+    </w:lvlOverride>
+    <w:lvlOverride w:ilvl="3">
+      <w:startOverride w:val="1"/>
+    </w:lvlOverride>
+    <w:lvlOverride w:ilvl="4">
+      <w:startOverride w:val="1"/>
+    </w:lvlOverride>
+    <w:lvlOverride w:ilvl="5">
+      <w:startOverride w:val="1"/>
+    </w:lvlOverride>
+    <w:lvlOverride w:ilvl="6">
+      <w:startOverride w:val="1"/>
+    </w:lvlOverride>
+    <w:lvlOverride w:ilvl="7">
+      <w:startOverride w:val="1"/>
+    </w:lvlOverride>
+    <w:lvlOverride w:ilvl="8">
+      <w:startOverride w:val="1"/>
+    </w:lvlOverride>
   </w:num>
 </w:numbering>
 </file>

</xml_diff>